<commit_message>
PR3: audit fixes (named feedback, larger graph text, end-quantity speech, Sketch It item), audit md, README row
Co-Authored-By: Claude Opus 5.5 <noreply@anthropic.com>
Claude-Session: https://claude.ai/code/session_013Y8PfETWcMLvmUEpCdE8Wq
</commit_message>
<xml_diff>
--- a/support-materials/PR3/PR3_worked_examples.docx
+++ b/support-materials/PR3/PR3_worked_examples.docx
@@ -114,7 +114,7 @@
           <w:sz w:val="40"/>
           <w:szCs w:val="40"/>
         </w:rPr>
-        <w:t xml:space="preserve">f(x)=2(x−3)</w:t>
+        <w:t xml:space="preserve">f(x)=2(x+4)(x−3)</w:t>
       </w:r>
       <w:r>
         <w:rPr>
@@ -126,6 +126,186 @@
         </w:rPr>
         <w:t xml:space="preserve">2</w:t>
       </w:r>
+    </w:p>
+    <w:p>
+      <w:pPr>
+        <w:pStyle w:val="Heading3"/>
+        <w:keepNext/>
+      </w:pPr>
+      <w:r>
+        <w:t xml:space="preserve">Question</w:t>
+      </w:r>
+    </w:p>
+    <w:p>
+      <w:pPr>
+        <w:spacing w:after="120" w:before="80" w:line="300"/>
+      </w:pPr>
+      <w:r>
+        <w:t xml:space="preserve">What are the zeros and their multiplicities?</w:t>
+      </w:r>
+    </w:p>
+    <w:p>
+      <w:pPr>
+        <w:spacing w:after="40" w:before="20"/>
+        <w:ind w:left="360"/>
+      </w:pPr>
+      <w:r>
+        <w:rPr>
+          <w:b/>
+          <w:bCs/>
+        </w:rPr>
+        <w:t xml:space="preserve">A.  </w:t>
+      </w:r>
+      <w:r>
+        <w:t xml:space="preserve">−3 with multiplicity 2, and 4 with multiplicity 1</w:t>
+      </w:r>
+    </w:p>
+    <w:p>
+      <w:pPr>
+        <w:spacing w:after="40" w:before="20"/>
+        <w:ind w:left="360"/>
+      </w:pPr>
+      <w:r>
+        <w:rPr>
+          <w:b/>
+          <w:bCs/>
+        </w:rPr>
+        <w:t xml:space="preserve">B.  </w:t>
+      </w:r>
+      <w:r>
+        <w:t xml:space="preserve">3 with multiplicity 2, and −4 with multiplicity 1</w:t>
+      </w:r>
+    </w:p>
+    <w:p>
+      <w:pPr>
+        <w:spacing w:after="40" w:before="20"/>
+        <w:ind w:left="360"/>
+      </w:pPr>
+      <w:r>
+        <w:rPr>
+          <w:b/>
+          <w:bCs/>
+        </w:rPr>
+        <w:t xml:space="preserve">C.  </w:t>
+      </w:r>
+      <w:r>
+        <w:t xml:space="preserve">3 with multiplicity 1, and −4 with multiplicity 2</w:t>
+      </w:r>
+    </w:p>
+    <w:p>
+      <w:pPr>
+        <w:spacing w:after="40" w:before="20"/>
+        <w:ind w:left="360"/>
+      </w:pPr>
+      <w:r>
+        <w:rPr>
+          <w:b/>
+          <w:bCs/>
+        </w:rPr>
+        <w:t xml:space="preserve">D.  </w:t>
+      </w:r>
+      <w:r>
+        <w:t xml:space="preserve">2, 3, and −4, each with multiplicity 1</w:t>
+      </w:r>
+    </w:p>
+    <w:p>
+      <w:pPr>
+        <w:pStyle w:val="Heading3"/>
+        <w:keepNext/>
+      </w:pPr>
+      <w:r>
+        <w:t xml:space="preserve">Answer and reasoning</w:t>
+      </w:r>
+    </w:p>
+    <w:p>
+      <w:pPr>
+        <w:spacing w:after="120" w:before="80" w:line="300"/>
+      </w:pPr>
+      <w:r>
+        <w:t xml:space="preserve">Set each factor equal to 0: </w:t>
+      </w:r>
+      <w:r>
+        <w:rPr>
+          <w:i/>
+          <w:iCs/>
+        </w:rPr>
+        <w:t xml:space="preserve">x−3=0</w:t>
+      </w:r>
+      <w:r>
+        <w:t xml:space="preserve"> gives </w:t>
+      </w:r>
+      <w:r>
+        <w:rPr>
+          <w:i/>
+          <w:iCs/>
+        </w:rPr>
+        <w:t xml:space="preserve">x=3</w:t>
+      </w:r>
+      <w:r>
+        <w:t xml:space="preserve">, and </w:t>
+      </w:r>
+      <w:r>
+        <w:rPr>
+          <w:i/>
+          <w:iCs/>
+        </w:rPr>
+        <w:t xml:space="preserve">x+4=0</w:t>
+      </w:r>
+      <w:r>
+        <w:t xml:space="preserve"> gives </w:t>
+      </w:r>
+      <w:r>
+        <w:rPr>
+          <w:i/>
+          <w:iCs/>
+        </w:rPr>
+        <w:t xml:space="preserve">x=−4</w:t>
+      </w:r>
+      <w:r>
+        <w:t xml:space="preserve">. The exponent on each factor is its multiplicity: 2 for </w:t>
+      </w:r>
+      <w:r>
+        <w:rPr>
+          <w:i/>
+          <w:iCs/>
+        </w:rPr>
+        <w:t xml:space="preserve">x=3</w:t>
+      </w:r>
+      <w:r>
+        <w:t xml:space="preserve"> and 1 for </w:t>
+      </w:r>
+      <w:r>
+        <w:rPr>
+          <w:i/>
+          <w:iCs/>
+        </w:rPr>
+        <w:t xml:space="preserve">x=−4</w:t>
+      </w:r>
+      <w:r>
+        <w:t xml:space="preserve">, since no exponent means 1. The order of the factors does not matter. Reading the signs as written gives −3 and 4, and the 2 in front is a coefficient, not a zero. </w:t>
+      </w:r>
+      <w:r>
+        <w:rPr>
+          <w:b/>
+          <w:bCs/>
+        </w:rPr>
+        <w:t xml:space="preserve">3 with multiplicity 2, and −4 with multiplicity 1.</w:t>
+      </w:r>
+    </w:p>
+    <w:p>
+      <w:pPr>
+        <w:pStyle w:val="Heading2"/>
+        <w:pageBreakBefore/>
+      </w:pPr>
+      <w:r>
+        <w:t xml:space="preserve">Example 2: Zeros 2</w:t>
+      </w:r>
+    </w:p>
+    <w:p>
+      <w:pPr>
+        <w:spacing w:after="200" w:before="200"/>
+        <w:jc w:val="center"/>
+      </w:pPr>
       <w:r>
         <w:rPr>
           <w:i/>
@@ -133,7 +313,36 @@
           <w:sz w:val="40"/>
           <w:szCs w:val="40"/>
         </w:rPr>
-        <w:t xml:space="preserve">(x+4)</w:t>
+        <w:t xml:space="preserve">f(x)=−5(x+2)</w:t>
+      </w:r>
+      <w:r>
+        <w:rPr>
+          <w:i/>
+          <w:iCs/>
+          <w:sz w:val="40"/>
+          <w:szCs w:val="40"/>
+          <w:vertAlign w:val="superscript"/>
+        </w:rPr>
+        <w:t xml:space="preserve">2</w:t>
+      </w:r>
+      <w:r>
+        <w:rPr>
+          <w:i/>
+          <w:iCs/>
+          <w:sz w:val="40"/>
+          <w:szCs w:val="40"/>
+        </w:rPr>
+        <w:t xml:space="preserve">(x−5)</w:t>
+      </w:r>
+      <w:r>
+        <w:rPr>
+          <w:i/>
+          <w:iCs/>
+          <w:sz w:val="40"/>
+          <w:szCs w:val="40"/>
+          <w:vertAlign w:val="superscript"/>
+        </w:rPr>
+        <w:t xml:space="preserve">2</w:t>
       </w:r>
     </w:p>
     <w:p>
@@ -166,7 +375,7 @@
         <w:t xml:space="preserve">A.  </w:t>
       </w:r>
       <w:r>
-        <w:t xml:space="preserve">−3 with multiplicity 2, and 4 with multiplicity 1</w:t>
+        <w:t xml:space="preserve">2 and −5, each with multiplicity 2</w:t>
       </w:r>
     </w:p>
     <w:p>
@@ -182,7 +391,7 @@
         <w:t xml:space="preserve">B.  </w:t>
       </w:r>
       <w:r>
-        <w:t xml:space="preserve">3 with multiplicity 2, and −4 with multiplicity 1</w:t>
+        <w:t xml:space="preserve">−2 and 5, each with multiplicity 1</w:t>
       </w:r>
     </w:p>
     <w:p>
@@ -198,7 +407,7 @@
         <w:t xml:space="preserve">C.  </w:t>
       </w:r>
       <w:r>
-        <w:t xml:space="preserve">3 with multiplicity 1, and −4 with multiplicity 2</w:t>
+        <w:t xml:space="preserve">−5, −2, and 5, each with multiplicity 2</w:t>
       </w:r>
     </w:p>
     <w:p>
@@ -214,7 +423,7 @@
         <w:t xml:space="preserve">D.  </w:t>
       </w:r>
       <w:r>
-        <w:t xml:space="preserve">2, 3, and −4, each with multiplicity 1</w:t>
+        <w:t xml:space="preserve">−2 and 5, each with multiplicity 2</w:t>
       </w:r>
     </w:p>
     <w:p>
@@ -231,14 +440,11 @@
         <w:spacing w:after="120" w:before="80" w:line="300"/>
       </w:pPr>
       <w:r>
-        <w:t xml:space="preserve">Set each factor equal to 0: </w:t>
-      </w:r>
-      <w:r>
-        <w:rPr>
-          <w:i/>
-          <w:iCs/>
-        </w:rPr>
-        <w:t xml:space="preserve">x−3=0</w:t>
+        <w:rPr>
+          <w:i/>
+          <w:iCs/>
+        </w:rPr>
+        <w:t xml:space="preserve">x+2=0</w:t>
       </w:r>
       <w:r>
         <w:t xml:space="preserve"> gives </w:t>
@@ -248,7 +454,7 @@
           <w:i/>
           <w:iCs/>
         </w:rPr>
-        <w:t xml:space="preserve">x=3</w:t>
+        <w:t xml:space="preserve">x=−2</w:t>
       </w:r>
       <w:r>
         <w:t xml:space="preserve">, and </w:t>
@@ -258,7 +464,7 @@
           <w:i/>
           <w:iCs/>
         </w:rPr>
-        <w:t xml:space="preserve">x+4=0</w:t>
+        <w:t xml:space="preserve">x−5=0</w:t>
       </w:r>
       <w:r>
         <w:t xml:space="preserve"> gives </w:t>
@@ -268,37 +474,17 @@
           <w:i/>
           <w:iCs/>
         </w:rPr>
-        <w:t xml:space="preserve">x=−4</w:t>
-      </w:r>
-      <w:r>
-        <w:t xml:space="preserve">. The exponent on each factor is its multiplicity: 2 for </w:t>
-      </w:r>
-      <w:r>
-        <w:rPr>
-          <w:i/>
-          <w:iCs/>
-        </w:rPr>
-        <w:t xml:space="preserve">x=3</w:t>
-      </w:r>
-      <w:r>
-        <w:t xml:space="preserve"> and 1 for </w:t>
-      </w:r>
-      <w:r>
-        <w:rPr>
-          <w:i/>
-          <w:iCs/>
-        </w:rPr>
-        <w:t xml:space="preserve">x=−4</w:t>
-      </w:r>
-      <w:r>
-        <w:t xml:space="preserve">, since no exponent means 1. Reading the signs as written gives −3 and 4, and the 2 in front is a coefficient, not a zero. </w:t>
-      </w:r>
-      <w:r>
-        <w:rPr>
-          <w:b/>
-          <w:bCs/>
-        </w:rPr>
-        <w:t xml:space="preserve">3 with multiplicity 2, and −4 with multiplicity 1.</w:t>
+        <w:t xml:space="preserve">x=5</w:t>
+      </w:r>
+      <w:r>
+        <w:t xml:space="preserve">. Both factors are squared, so both zeros have multiplicity 2. The −5 in front is the leading coefficient; it changes the height and flips the graph, but it is not a zero. </w:t>
+      </w:r>
+      <w:r>
+        <w:rPr>
+          <w:b/>
+          <w:bCs/>
+        </w:rPr>
+        <w:t xml:space="preserve">−2 and 5, each with multiplicity 2.</w:t>
       </w:r>
     </w:p>
     <w:p>
@@ -307,7 +493,7 @@
         <w:pageBreakBefore/>
       </w:pPr>
       <w:r>
-        <w:t xml:space="preserve">Example 2: Zeros 2</w:t>
+        <w:t xml:space="preserve">Example 3: Zeros 3</w:t>
       </w:r>
     </w:p>
     <w:p>
@@ -322,7 +508,7 @@
           <w:sz w:val="40"/>
           <w:szCs w:val="40"/>
         </w:rPr>
-        <w:t xml:space="preserve">f(x)=−5(x+2)</w:t>
+        <w:t xml:space="preserve">f(x)=3(x−4)</w:t>
       </w:r>
       <w:r>
         <w:rPr>
@@ -341,17 +527,223 @@
           <w:sz w:val="40"/>
           <w:szCs w:val="40"/>
         </w:rPr>
-        <w:t xml:space="preserve">(x−5)</w:t>
-      </w:r>
+        <w:t xml:space="preserve">(x+1)</w:t>
+      </w:r>
+    </w:p>
+    <w:p>
+      <w:pPr>
+        <w:pStyle w:val="Heading3"/>
+        <w:keepNext/>
+      </w:pPr>
+      <w:r>
+        <w:t xml:space="preserve">Question</w:t>
+      </w:r>
+    </w:p>
+    <w:p>
+      <w:pPr>
+        <w:spacing w:after="120" w:before="80" w:line="300"/>
+      </w:pPr>
+      <w:r>
+        <w:t xml:space="preserve">What does the graph do at x = 4?</w:t>
+      </w:r>
+    </w:p>
+    <w:p>
+      <w:pPr>
+        <w:spacing w:after="40" w:before="20"/>
+        <w:ind w:left="360"/>
+      </w:pPr>
+      <w:r>
+        <w:rPr>
+          <w:b/>
+          <w:bCs/>
+        </w:rPr>
+        <w:t xml:space="preserve">A.  </w:t>
+      </w:r>
+      <w:r>
+        <w:t xml:space="preserve">It goes straight through the x-axis to the other side.</w:t>
+      </w:r>
+    </w:p>
+    <w:p>
+      <w:pPr>
+        <w:spacing w:after="40" w:before="20"/>
+        <w:ind w:left="360"/>
+      </w:pPr>
+      <w:r>
+        <w:rPr>
+          <w:b/>
+          <w:bCs/>
+        </w:rPr>
+        <w:t xml:space="preserve">B.  </w:t>
+      </w:r>
+      <w:r>
+        <w:t xml:space="preserve">It has a vertical asymptote there.</w:t>
+      </w:r>
+    </w:p>
+    <w:p>
+      <w:pPr>
+        <w:spacing w:after="40" w:before="20"/>
+        <w:ind w:left="360"/>
+      </w:pPr>
+      <w:r>
+        <w:rPr>
+          <w:b/>
+          <w:bCs/>
+        </w:rPr>
+        <w:t xml:space="preserve">C.  </w:t>
+      </w:r>
+      <w:r>
+        <w:t xml:space="preserve">It meets the x-axis and turns back the way it came.</w:t>
+      </w:r>
+    </w:p>
+    <w:p>
+      <w:pPr>
+        <w:spacing w:after="40" w:before="20"/>
+        <w:ind w:left="360"/>
+      </w:pPr>
+      <w:r>
+        <w:rPr>
+          <w:b/>
+          <w:bCs/>
+        </w:rPr>
+        <w:t xml:space="preserve">D.  </w:t>
+      </w:r>
+      <w:r>
+        <w:t xml:space="preserve">It stays above the x-axis without reaching it.</w:t>
+      </w:r>
+    </w:p>
+    <w:p>
+      <w:pPr>
+        <w:pStyle w:val="Heading3"/>
+        <w:keepNext/>
+      </w:pPr>
+      <w:r>
+        <w:t xml:space="preserve">Answer and reasoning</w:t>
+      </w:r>
+    </w:p>
+    <w:p>
+      <w:pPr>
+        <w:spacing w:after="120" w:before="80" w:line="300"/>
+      </w:pPr>
+      <w:r>
+        <w:t xml:space="preserve">The factor </w:t>
+      </w:r>
+      <w:r>
+        <w:rPr>
+          <w:i/>
+          <w:iCs/>
+        </w:rPr>
+        <w:t xml:space="preserve">(x−4)</w:t>
+      </w:r>
+      <w:r>
+        <w:t xml:space="preserve"> is squared, so </w:t>
+      </w:r>
+      <w:r>
+        <w:rPr>
+          <w:i/>
+          <w:iCs/>
+        </w:rPr>
+        <w:t xml:space="preserve">x=4</w:t>
+      </w:r>
+      <w:r>
+        <w:t xml:space="preserve"> has even multiplicity. A square is never negative, so </w:t>
+      </w:r>
+      <w:r>
+        <w:rPr>
+          <w:i/>
+          <w:iCs/>
+        </w:rPr>
+        <w:t xml:space="preserve">(x−4)</w:t>
+      </w:r>
+      <w:r>
+        <w:rPr>
+          <w:i/>
+          <w:iCs/>
+          <w:vertAlign w:val="superscript"/>
+        </w:rPr>
+        <w:t xml:space="preserve">2</w:t>
+      </w:r>
+      <w:r>
+        <w:t xml:space="preserve"> does not change sign as </w:t>
+      </w:r>
+      <w:r>
+        <w:rPr>
+          <w:i/>
+          <w:iCs/>
+        </w:rPr>
+        <w:t xml:space="preserve">x</w:t>
+      </w:r>
+      <w:r>
+        <w:t xml:space="preserve"> passes 4: the graph touches the </w:t>
+      </w:r>
+      <w:r>
+        <w:rPr>
+          <w:i/>
+          <w:iCs/>
+        </w:rPr>
+        <w:t xml:space="preserve">x</w:t>
+      </w:r>
+      <w:r>
+        <w:t xml:space="preserve">-axis and turns around. At </w:t>
+      </w:r>
+      <w:r>
+        <w:rPr>
+          <w:i/>
+          <w:iCs/>
+        </w:rPr>
+        <w:t xml:space="preserve">x=−1</w:t>
+      </w:r>
+      <w:r>
+        <w:t xml:space="preserve">, multiplicity 1, it crosses instead. Polynomials never have vertical asymptotes. </w:t>
+      </w:r>
+      <w:r>
+        <w:rPr>
+          <w:b/>
+          <w:bCs/>
+        </w:rPr>
+        <w:t xml:space="preserve">It touches the x-axis and turns around.</w:t>
+      </w:r>
+    </w:p>
+    <w:p>
+      <w:pPr>
+        <w:pStyle w:val="Heading2"/>
+        <w:pageBreakBefore/>
+      </w:pPr>
+      <w:r>
+        <w:t xml:space="preserve">Example 4: Zeros 4</w:t>
+      </w:r>
+    </w:p>
+    <w:p>
+      <w:pPr>
+        <w:spacing w:after="200" w:before="200"/>
+        <w:jc w:val="center"/>
+      </w:pPr>
       <w:r>
         <w:rPr>
           <w:i/>
           <w:iCs/>
           <w:sz w:val="40"/>
           <w:szCs w:val="40"/>
-          <w:vertAlign w:val="superscript"/>
-        </w:rPr>
-        <w:t xml:space="preserve">2</w:t>
+        </w:rPr>
+        <w:t xml:space="preserve">f(x)=−2(x+5)</w:t>
+      </w:r>
+      <w:r>
+        <w:rPr>
+          <w:i/>
+          <w:iCs/>
+          <w:sz w:val="40"/>
+          <w:szCs w:val="40"/>
+          <w:vertAlign w:val="superscript"/>
+        </w:rPr>
+        <w:t xml:space="preserve">2</w:t>
+      </w:r>
+      <w:r>
+        <w:rPr>
+          <w:i/>
+          <w:iCs/>
+          <w:sz w:val="40"/>
+          <w:szCs w:val="40"/>
+        </w:rPr>
+        <w:t xml:space="preserve">(x−2)</w:t>
       </w:r>
     </w:p>
     <w:p>
@@ -368,7 +760,7 @@
         <w:spacing w:after="120" w:before="80" w:line="300"/>
       </w:pPr>
       <w:r>
-        <w:t xml:space="preserve">What are the zeros and their multiplicities?</w:t>
+        <w:t xml:space="preserve">Which describes the graph at its zeros?</w:t>
       </w:r>
     </w:p>
     <w:p>
@@ -384,7 +776,7 @@
         <w:t xml:space="preserve">A.  </w:t>
       </w:r>
       <w:r>
-        <w:t xml:space="preserve">2 and −5, each with multiplicity 2</w:t>
+        <w:t xml:space="preserve">At −5 it turns around at the axis; at 2 it goes through.</w:t>
       </w:r>
     </w:p>
     <w:p>
@@ -400,7 +792,7 @@
         <w:t xml:space="preserve">B.  </w:t>
       </w:r>
       <w:r>
-        <w:t xml:space="preserve">−2 and 5, each with multiplicity 1</w:t>
+        <w:t xml:space="preserve">At −5 it goes through the axis; at 2 it turns around.</w:t>
       </w:r>
     </w:p>
     <w:p>
@@ -416,7 +808,7 @@
         <w:t xml:space="preserve">C.  </w:t>
       </w:r>
       <w:r>
-        <w:t xml:space="preserve">−5, −2, and 5, each with multiplicity 2</w:t>
+        <w:t xml:space="preserve">At 5 it turns around at the axis; at −2 it goes through.</w:t>
       </w:r>
     </w:p>
     <w:p>
@@ -432,7 +824,7 @@
         <w:t xml:space="preserve">D.  </w:t>
       </w:r>
       <w:r>
-        <w:t xml:space="preserve">−2 and 5, each with multiplicity 2</w:t>
+        <w:t xml:space="preserve">It goes through the x-axis at both −5 and 2.</w:t>
       </w:r>
     </w:p>
     <w:p>
@@ -449,51 +841,54 @@
         <w:spacing w:after="120" w:before="80" w:line="300"/>
       </w:pPr>
       <w:r>
-        <w:rPr>
-          <w:i/>
-          <w:iCs/>
-        </w:rPr>
-        <w:t xml:space="preserve">x+2=0</w:t>
-      </w:r>
-      <w:r>
-        <w:t xml:space="preserve"> gives </w:t>
-      </w:r>
-      <w:r>
-        <w:rPr>
-          <w:i/>
-          <w:iCs/>
-        </w:rPr>
-        <w:t xml:space="preserve">x=−2</w:t>
-      </w:r>
-      <w:r>
-        <w:t xml:space="preserve">, and </w:t>
-      </w:r>
-      <w:r>
-        <w:rPr>
-          <w:i/>
-          <w:iCs/>
-        </w:rPr>
-        <w:t xml:space="preserve">x−5=0</w:t>
-      </w:r>
-      <w:r>
-        <w:t xml:space="preserve"> gives </w:t>
-      </w:r>
-      <w:r>
-        <w:rPr>
-          <w:i/>
-          <w:iCs/>
-        </w:rPr>
-        <w:t xml:space="preserve">x=5</w:t>
-      </w:r>
-      <w:r>
-        <w:t xml:space="preserve">. Both factors are squared, so both zeros have multiplicity 2. The −5 in front is the leading coefficient; it changes the height and flips the graph, but it is not a zero. </w:t>
-      </w:r>
-      <w:r>
-        <w:rPr>
-          <w:b/>
-          <w:bCs/>
-        </w:rPr>
-        <w:t xml:space="preserve">−2 and 5, each with multiplicity 2.</w:t>
+        <w:t xml:space="preserve">The zeros are </w:t>
+      </w:r>
+      <w:r>
+        <w:rPr>
+          <w:i/>
+          <w:iCs/>
+        </w:rPr>
+        <w:t xml:space="preserve">−5</w:t>
+      </w:r>
+      <w:r>
+        <w:t xml:space="preserve">, with multiplicity 2 because </w:t>
+      </w:r>
+      <w:r>
+        <w:rPr>
+          <w:i/>
+          <w:iCs/>
+        </w:rPr>
+        <w:t xml:space="preserve">(x+5)</w:t>
+      </w:r>
+      <w:r>
+        <w:t xml:space="preserve"> is squared, and </w:t>
+      </w:r>
+      <w:r>
+        <w:rPr>
+          <w:i/>
+          <w:iCs/>
+        </w:rPr>
+        <w:t xml:space="preserve">2</w:t>
+      </w:r>
+      <w:r>
+        <w:t xml:space="preserve">, with multiplicity 1. Even multiplicity: touch and turn around. Odd: cross. Saying it turns at 2 and goes through at −5 swaps them; using 5 and −2 reads the signs as written; going through at both ignores the square. The </w:t>
+      </w:r>
+      <w:r>
+        <w:rPr>
+          <w:i/>
+          <w:iCs/>
+        </w:rPr>
+        <w:t xml:space="preserve">−2</w:t>
+      </w:r>
+      <w:r>
+        <w:t xml:space="preserve"> in front flips the graph upside down, but it does not change touching into crossing. </w:t>
+      </w:r>
+      <w:r>
+        <w:rPr>
+          <w:b/>
+          <w:bCs/>
+        </w:rPr>
+        <w:t xml:space="preserve">Touches at −5, crosses at 2.</w:t>
       </w:r>
     </w:p>
     <w:p>
@@ -502,7 +897,7 @@
         <w:pageBreakBefore/>
       </w:pPr>
       <w:r>
-        <w:t xml:space="preserve">Example 3: Zeros 3</w:t>
+        <w:t xml:space="preserve">Example 5: Intercept 1</w:t>
       </w:r>
     </w:p>
     <w:p>
@@ -517,7 +912,7 @@
           <w:sz w:val="40"/>
           <w:szCs w:val="40"/>
         </w:rPr>
-        <w:t xml:space="preserve">f(x)=3(x−4)</w:t>
+        <w:t xml:space="preserve">f(x)=2(x+4)(x−3)</w:t>
       </w:r>
       <w:r>
         <w:rPr>
@@ -529,6 +924,212 @@
         </w:rPr>
         <w:t xml:space="preserve">2</w:t>
       </w:r>
+    </w:p>
+    <w:p>
+      <w:pPr>
+        <w:pStyle w:val="Heading3"/>
+        <w:keepNext/>
+      </w:pPr>
+      <w:r>
+        <w:t xml:space="preserve">Question</w:t>
+      </w:r>
+    </w:p>
+    <w:p>
+      <w:pPr>
+        <w:spacing w:after="120" w:before="80" w:line="300"/>
+      </w:pPr>
+      <w:r>
+        <w:t xml:space="preserve">What is the y-intercept?</w:t>
+      </w:r>
+    </w:p>
+    <w:p>
+      <w:pPr>
+        <w:spacing w:after="40" w:before="20"/>
+        <w:ind w:left="360"/>
+      </w:pPr>
+      <w:r>
+        <w:rPr>
+          <w:b/>
+          <w:bCs/>
+        </w:rPr>
+        <w:t xml:space="preserve">A.  </w:t>
+      </w:r>
+      <w:r>
+        <w:t xml:space="preserve">(0, 24)</w:t>
+      </w:r>
+    </w:p>
+    <w:p>
+      <w:pPr>
+        <w:spacing w:after="40" w:before="20"/>
+        <w:ind w:left="360"/>
+      </w:pPr>
+      <w:r>
+        <w:rPr>
+          <w:b/>
+          <w:bCs/>
+        </w:rPr>
+        <w:t xml:space="preserve">B.  </w:t>
+      </w:r>
+      <w:r>
+        <w:t xml:space="preserve">(0, −72)</w:t>
+      </w:r>
+    </w:p>
+    <w:p>
+      <w:pPr>
+        <w:spacing w:after="40" w:before="20"/>
+        <w:ind w:left="360"/>
+      </w:pPr>
+      <w:r>
+        <w:rPr>
+          <w:b/>
+          <w:bCs/>
+        </w:rPr>
+        <w:t xml:space="preserve">C.  </w:t>
+      </w:r>
+      <w:r>
+        <w:t xml:space="preserve">(0, 2)</w:t>
+      </w:r>
+    </w:p>
+    <w:p>
+      <w:pPr>
+        <w:spacing w:after="40" w:before="20"/>
+        <w:ind w:left="360"/>
+      </w:pPr>
+      <w:r>
+        <w:rPr>
+          <w:b/>
+          <w:bCs/>
+        </w:rPr>
+        <w:t xml:space="preserve">D.  </w:t>
+      </w:r>
+      <w:r>
+        <w:t xml:space="preserve">(0, 72)</w:t>
+      </w:r>
+    </w:p>
+    <w:p>
+      <w:pPr>
+        <w:pStyle w:val="Heading3"/>
+        <w:keepNext/>
+      </w:pPr>
+      <w:r>
+        <w:t xml:space="preserve">Answer and reasoning</w:t>
+      </w:r>
+    </w:p>
+    <w:p>
+      <w:pPr>
+        <w:spacing w:after="120" w:before="80" w:line="300"/>
+      </w:pPr>
+      <w:r>
+        <w:rPr>
+          <w:i/>
+          <w:iCs/>
+        </w:rPr>
+        <w:t xml:space="preserve">f(0)=2(0+4)(0−3)</w:t>
+      </w:r>
+      <w:r>
+        <w:rPr>
+          <w:i/>
+          <w:iCs/>
+          <w:vertAlign w:val="superscript"/>
+        </w:rPr>
+        <w:t xml:space="preserve">2</w:t>
+      </w:r>
+      <w:r>
+        <w:rPr>
+          <w:i/>
+          <w:iCs/>
+        </w:rPr>
+        <w:t xml:space="preserve">=2· 4· 9=72</w:t>
+      </w:r>
+      <w:r>
+        <w:t xml:space="preserve">. Square first: </w:t>
+      </w:r>
+      <w:r>
+        <w:rPr>
+          <w:i/>
+          <w:iCs/>
+        </w:rPr>
+        <w:t xml:space="preserve">(−3)</w:t>
+      </w:r>
+      <w:r>
+        <w:rPr>
+          <w:i/>
+          <w:iCs/>
+          <w:vertAlign w:val="superscript"/>
+        </w:rPr>
+        <w:t xml:space="preserve">2</w:t>
+      </w:r>
+      <w:r>
+        <w:rPr>
+          <w:i/>
+          <w:iCs/>
+        </w:rPr>
+        <w:t xml:space="preserve">=9</w:t>
+      </w:r>
+      <w:r>
+        <w:t xml:space="preserve">, which is positive. The answer 24 forgets the square, </w:t>
+      </w:r>
+      <w:r>
+        <w:rPr>
+          <w:i/>
+          <w:iCs/>
+        </w:rPr>
+        <w:t xml:space="preserve">2· 4· 3</w:t>
+      </w:r>
+      <w:r>
+        <w:t xml:space="preserve">; −72 squares </w:t>
+      </w:r>
+      <w:r>
+        <w:rPr>
+          <w:i/>
+          <w:iCs/>
+        </w:rPr>
+        <w:t xml:space="preserve">−3</w:t>
+      </w:r>
+      <w:r>
+        <w:t xml:space="preserve"> to get </w:t>
+      </w:r>
+      <w:r>
+        <w:rPr>
+          <w:i/>
+          <w:iCs/>
+        </w:rPr>
+        <w:t xml:space="preserve">−9</w:t>
+      </w:r>
+      <w:r>
+        <w:t xml:space="preserve">; and 2 is just the coefficient. </w:t>
+      </w:r>
+      <w:r>
+        <w:rPr>
+          <w:b/>
+          <w:bCs/>
+          <w:i/>
+          <w:iCs/>
+        </w:rPr>
+        <w:t xml:space="preserve">(0,72)</w:t>
+      </w:r>
+      <w:r>
+        <w:rPr>
+          <w:b/>
+          <w:bCs/>
+        </w:rPr>
+        <w:t xml:space="preserve">.</w:t>
+      </w:r>
+    </w:p>
+    <w:p>
+      <w:pPr>
+        <w:pStyle w:val="Heading2"/>
+        <w:pageBreakBefore/>
+      </w:pPr>
+      <w:r>
+        <w:t xml:space="preserve">Example 6: Intercept 2</w:t>
+      </w:r>
+    </w:p>
+    <w:p>
+      <w:pPr>
+        <w:spacing w:after="200" w:before="200"/>
+        <w:jc w:val="center"/>
+      </w:pPr>
       <w:r>
         <w:rPr>
           <w:i/>
@@ -536,7 +1137,36 @@
           <w:sz w:val="40"/>
           <w:szCs w:val="40"/>
         </w:rPr>
-        <w:t xml:space="preserve">(x+1)</w:t>
+        <w:t xml:space="preserve">f(x)=−3(x+2)</w:t>
+      </w:r>
+      <w:r>
+        <w:rPr>
+          <w:i/>
+          <w:iCs/>
+          <w:sz w:val="40"/>
+          <w:szCs w:val="40"/>
+          <w:vertAlign w:val="superscript"/>
+        </w:rPr>
+        <w:t xml:space="preserve">2</w:t>
+      </w:r>
+      <w:r>
+        <w:rPr>
+          <w:i/>
+          <w:iCs/>
+          <w:sz w:val="40"/>
+          <w:szCs w:val="40"/>
+        </w:rPr>
+        <w:t xml:space="preserve">(x−5)</w:t>
+      </w:r>
+      <w:r>
+        <w:rPr>
+          <w:i/>
+          <w:iCs/>
+          <w:sz w:val="40"/>
+          <w:szCs w:val="40"/>
+          <w:vertAlign w:val="superscript"/>
+        </w:rPr>
+        <w:t xml:space="preserve">2</w:t>
       </w:r>
     </w:p>
     <w:p>
@@ -553,7 +1183,7 @@
         <w:spacing w:after="120" w:before="80" w:line="300"/>
       </w:pPr>
       <w:r>
-        <w:t xml:space="preserve">What does the graph do at x = 4?</w:t>
+        <w:t xml:space="preserve">What is the y-intercept?</w:t>
       </w:r>
     </w:p>
     <w:p>
@@ -569,7 +1199,7 @@
         <w:t xml:space="preserve">A.  </w:t>
       </w:r>
       <w:r>
-        <w:t xml:space="preserve">It goes straight through the x-axis to the other side.</w:t>
+        <w:t xml:space="preserve">(0, −300)</w:t>
       </w:r>
     </w:p>
     <w:p>
@@ -585,7 +1215,7 @@
         <w:t xml:space="preserve">B.  </w:t>
       </w:r>
       <w:r>
-        <w:t xml:space="preserve">It has a vertical asymptote there.</w:t>
+        <w:t xml:space="preserve">(0, 300)</w:t>
       </w:r>
     </w:p>
     <w:p>
@@ -601,7 +1231,7 @@
         <w:t xml:space="preserve">C.  </w:t>
       </w:r>
       <w:r>
-        <w:t xml:space="preserve">It meets the x-axis and turns back the way it came.</w:t>
+        <w:t xml:space="preserve">(0, −30)</w:t>
       </w:r>
     </w:p>
     <w:p>
@@ -617,7 +1247,7 @@
         <w:t xml:space="preserve">D.  </w:t>
       </w:r>
       <w:r>
-        <w:t xml:space="preserve">It stays above the x-axis without reaching it.</w:t>
+        <w:t xml:space="preserve">(0, −150)</w:t>
       </w:r>
     </w:p>
     <w:p>
@@ -634,82 +1264,60 @@
         <w:spacing w:after="120" w:before="80" w:line="300"/>
       </w:pPr>
       <w:r>
-        <w:t xml:space="preserve">The factor </w:t>
-      </w:r>
-      <w:r>
-        <w:rPr>
-          <w:i/>
-          <w:iCs/>
-        </w:rPr>
-        <w:t xml:space="preserve">(x−4)</w:t>
-      </w:r>
-      <w:r>
-        <w:t xml:space="preserve"> is squared, so </w:t>
-      </w:r>
-      <w:r>
-        <w:rPr>
-          <w:i/>
-          <w:iCs/>
-        </w:rPr>
-        <w:t xml:space="preserve">x=4</w:t>
-      </w:r>
-      <w:r>
-        <w:t xml:space="preserve"> has even multiplicity. A square is never negative, so </w:t>
-      </w:r>
-      <w:r>
-        <w:rPr>
-          <w:i/>
-          <w:iCs/>
-        </w:rPr>
-        <w:t xml:space="preserve">(x−4)</w:t>
-      </w:r>
-      <w:r>
-        <w:rPr>
-          <w:i/>
-          <w:iCs/>
-          <w:vertAlign w:val="superscript"/>
-        </w:rPr>
-        <w:t xml:space="preserve">2</w:t>
-      </w:r>
-      <w:r>
-        <w:t xml:space="preserve"> does not change sign as </w:t>
-      </w:r>
-      <w:r>
-        <w:rPr>
-          <w:i/>
-          <w:iCs/>
-        </w:rPr>
-        <w:t xml:space="preserve">x</w:t>
-      </w:r>
-      <w:r>
-        <w:t xml:space="preserve"> passes 4: the graph touches the </w:t>
-      </w:r>
-      <w:r>
-        <w:rPr>
-          <w:i/>
-          <w:iCs/>
-        </w:rPr>
-        <w:t xml:space="preserve">x</w:t>
-      </w:r>
-      <w:r>
-        <w:t xml:space="preserve">-axis and turns around. At </w:t>
-      </w:r>
-      <w:r>
-        <w:rPr>
-          <w:i/>
-          <w:iCs/>
-        </w:rPr>
-        <w:t xml:space="preserve">x=−1</w:t>
-      </w:r>
-      <w:r>
-        <w:t xml:space="preserve">, multiplicity 1, it crosses instead. Polynomials never have vertical asymptotes. </w:t>
-      </w:r>
-      <w:r>
-        <w:rPr>
-          <w:b/>
-          <w:bCs/>
-        </w:rPr>
-        <w:t xml:space="preserve">It touches the x-axis and turns around.</w:t>
+        <w:rPr>
+          <w:i/>
+          <w:iCs/>
+        </w:rPr>
+        <w:t xml:space="preserve">f(0)=−3(2)</w:t>
+      </w:r>
+      <w:r>
+        <w:rPr>
+          <w:i/>
+          <w:iCs/>
+          <w:vertAlign w:val="superscript"/>
+        </w:rPr>
+        <w:t xml:space="preserve">2</w:t>
+      </w:r>
+      <w:r>
+        <w:rPr>
+          <w:i/>
+          <w:iCs/>
+        </w:rPr>
+        <w:t xml:space="preserve">(−5)</w:t>
+      </w:r>
+      <w:r>
+        <w:rPr>
+          <w:i/>
+          <w:iCs/>
+          <w:vertAlign w:val="superscript"/>
+        </w:rPr>
+        <w:t xml:space="preserve">2</w:t>
+      </w:r>
+      <w:r>
+        <w:rPr>
+          <w:i/>
+          <w:iCs/>
+        </w:rPr>
+        <w:t xml:space="preserve">=−3· 4· 25=−300</w:t>
+      </w:r>
+      <w:r>
+        <w:t xml:space="preserve">. Both squares are positive, so the sign comes only from the −3. The answer 300 loses that sign, −30 forgets both squares, and −150 squares only one of them. </w:t>
+      </w:r>
+      <w:r>
+        <w:rPr>
+          <w:b/>
+          <w:bCs/>
+          <w:i/>
+          <w:iCs/>
+        </w:rPr>
+        <w:t xml:space="preserve">(0,−300)</w:t>
+      </w:r>
+      <w:r>
+        <w:rPr>
+          <w:b/>
+          <w:bCs/>
+        </w:rPr>
+        <w:t xml:space="preserve">.</w:t>
       </w:r>
     </w:p>
     <w:p>
@@ -718,7 +1326,7 @@
         <w:pageBreakBefore/>
       </w:pPr>
       <w:r>
-        <w:t xml:space="preserve">Example 4: Zeros 4</w:t>
+        <w:t xml:space="preserve">Example 7: Ends 1</w:t>
       </w:r>
     </w:p>
     <w:p>
@@ -733,7 +1341,7 @@
           <w:sz w:val="40"/>
           <w:szCs w:val="40"/>
         </w:rPr>
-        <w:t xml:space="preserve">f(x)=−2(x+5)</w:t>
+        <w:t xml:space="preserve">f(x)=4(x−2)</w:t>
       </w:r>
       <w:r>
         <w:rPr>
@@ -752,7 +1360,7 @@
           <w:sz w:val="40"/>
           <w:szCs w:val="40"/>
         </w:rPr>
-        <w:t xml:space="preserve">(x−2)</w:t>
+        <w:t xml:space="preserve">(x+3)</w:t>
       </w:r>
     </w:p>
     <w:p>
@@ -769,7 +1377,7 @@
         <w:spacing w:after="120" w:before="80" w:line="300"/>
       </w:pPr>
       <w:r>
-        <w:t xml:space="preserve">Which describes the graph at its zeros?</w:t>
+        <w:t xml:space="preserve">Which describes the end behavior?</w:t>
       </w:r>
     </w:p>
     <w:p>
@@ -785,7 +1393,7 @@
         <w:t xml:space="preserve">A.  </w:t>
       </w:r>
       <w:r>
-        <w:t xml:space="preserve">At −5 it turns around at the axis; at 2 it goes through.</w:t>
+        <w:t xml:space="preserve">Both ends go up</w:t>
       </w:r>
     </w:p>
     <w:p>
@@ -801,7 +1409,7 @@
         <w:t xml:space="preserve">B.  </w:t>
       </w:r>
       <w:r>
-        <w:t xml:space="preserve">At −5 it goes through the axis; at 2 it turns around.</w:t>
+        <w:t xml:space="preserve">Left end down, right end up</w:t>
       </w:r>
     </w:p>
     <w:p>
@@ -817,7 +1425,7 @@
         <w:t xml:space="preserve">C.  </w:t>
       </w:r>
       <w:r>
-        <w:t xml:space="preserve">At 5 it turns around at the axis; at −2 it goes through.</w:t>
+        <w:t xml:space="preserve">Left end up, right end down</w:t>
       </w:r>
     </w:p>
     <w:p>
@@ -833,7 +1441,7 @@
         <w:t xml:space="preserve">D.  </w:t>
       </w:r>
       <w:r>
-        <w:t xml:space="preserve">It goes through the x-axis at both −5 and 2.</w:t>
+        <w:t xml:space="preserve">Both ends go down</w:t>
       </w:r>
     </w:p>
     <w:p>
@@ -850,54 +1458,82 @@
         <w:spacing w:after="120" w:before="80" w:line="300"/>
       </w:pPr>
       <w:r>
-        <w:t xml:space="preserve">The zeros are </w:t>
-      </w:r>
-      <w:r>
-        <w:rPr>
-          <w:i/>
-          <w:iCs/>
-        </w:rPr>
-        <w:t xml:space="preserve">−5</w:t>
-      </w:r>
-      <w:r>
-        <w:t xml:space="preserve">, with multiplicity 2 because </w:t>
-      </w:r>
-      <w:r>
-        <w:rPr>
-          <w:i/>
-          <w:iCs/>
-        </w:rPr>
-        <w:t xml:space="preserve">(x+5)</w:t>
-      </w:r>
-      <w:r>
-        <w:t xml:space="preserve"> is squared, and </w:t>
-      </w:r>
-      <w:r>
-        <w:rPr>
-          <w:i/>
-          <w:iCs/>
-        </w:rPr>
-        <w:t xml:space="preserve">2</w:t>
-      </w:r>
-      <w:r>
-        <w:t xml:space="preserve">, with multiplicity 1. Even multiplicity: touch and turn around. Odd: cross. The second choice swaps them, the third reads the signs as written, and the last ignores the square. The </w:t>
-      </w:r>
-      <w:r>
-        <w:rPr>
-          <w:i/>
-          <w:iCs/>
-        </w:rPr>
-        <w:t xml:space="preserve">−2</w:t>
-      </w:r>
-      <w:r>
-        <w:t xml:space="preserve"> in front flips the graph upside down, but it does not change touching into crossing. </w:t>
-      </w:r>
-      <w:r>
-        <w:rPr>
-          <w:b/>
-          <w:bCs/>
-        </w:rPr>
-        <w:t xml:space="preserve">Touches at −5, crosses at 2.</w:t>
+        <w:t xml:space="preserve">The degree is </w:t>
+      </w:r>
+      <w:r>
+        <w:rPr>
+          <w:i/>
+          <w:iCs/>
+        </w:rPr>
+        <w:t xml:space="preserve">2+1=3</w:t>
+      </w:r>
+      <w:r>
+        <w:t xml:space="preserve">, which is odd, so the ends go opposite ways. The leading coefficient 4 is positive, so the graph goes up on the right, like </w:t>
+      </w:r>
+      <w:r>
+        <w:rPr>
+          <w:i/>
+          <w:iCs/>
+        </w:rPr>
+        <w:t xml:space="preserve">y=x</w:t>
+      </w:r>
+      <w:r>
+        <w:rPr>
+          <w:i/>
+          <w:iCs/>
+          <w:vertAlign w:val="superscript"/>
+        </w:rPr>
+        <w:t xml:space="preserve">3</w:t>
+      </w:r>
+      <w:r>
+        <w:t xml:space="preserve">. In CheckIt's words: as </w:t>
+      </w:r>
+      <w:r>
+        <w:rPr>
+          <w:i/>
+          <w:iCs/>
+        </w:rPr>
+        <w:t xml:space="preserve">x</w:t>
+      </w:r>
+      <w:r>
+        <w:t xml:space="preserve"> approaches infinity, </w:t>
+      </w:r>
+      <w:r>
+        <w:rPr>
+          <w:i/>
+          <w:iCs/>
+        </w:rPr>
+        <w:t xml:space="preserve">y</w:t>
+      </w:r>
+      <w:r>
+        <w:t xml:space="preserve"> approaches positive infinity; as </w:t>
+      </w:r>
+      <w:r>
+        <w:rPr>
+          <w:i/>
+          <w:iCs/>
+        </w:rPr>
+        <w:t xml:space="preserve">x</w:t>
+      </w:r>
+      <w:r>
+        <w:t xml:space="preserve"> approaches negative infinity, </w:t>
+      </w:r>
+      <w:r>
+        <w:rPr>
+          <w:i/>
+          <w:iCs/>
+        </w:rPr>
+        <w:t xml:space="preserve">y</w:t>
+      </w:r>
+      <w:r>
+        <w:t xml:space="preserve"> approaches negative infinity. </w:t>
+      </w:r>
+      <w:r>
+        <w:rPr>
+          <w:b/>
+          <w:bCs/>
+        </w:rPr>
+        <w:t xml:space="preserve">Down on the left, up on the right.</w:t>
       </w:r>
     </w:p>
     <w:p>
@@ -906,7 +1542,7 @@
         <w:pageBreakBefore/>
       </w:pPr>
       <w:r>
-        <w:t xml:space="preserve">Example 5: Intercept 1</w:t>
+        <w:t xml:space="preserve">Example 8: Ends 2</w:t>
       </w:r>
     </w:p>
     <w:p>
@@ -921,7 +1557,7 @@
           <w:sz w:val="40"/>
           <w:szCs w:val="40"/>
         </w:rPr>
-        <w:t xml:space="preserve">f(x)=2(x−3)</w:t>
+        <w:t xml:space="preserve">f(x)=−2(x+4)</w:t>
       </w:r>
       <w:r>
         <w:rPr>
@@ -940,7 +1576,17 @@
           <w:sz w:val="40"/>
           <w:szCs w:val="40"/>
         </w:rPr>
-        <w:t xml:space="preserve">(x+4)</w:t>
+        <w:t xml:space="preserve">(x−1)</w:t>
+      </w:r>
+      <w:r>
+        <w:rPr>
+          <w:i/>
+          <w:iCs/>
+          <w:sz w:val="40"/>
+          <w:szCs w:val="40"/>
+          <w:vertAlign w:val="superscript"/>
+        </w:rPr>
+        <w:t xml:space="preserve">2</w:t>
       </w:r>
     </w:p>
     <w:p>
@@ -957,7 +1603,7 @@
         <w:spacing w:after="120" w:before="80" w:line="300"/>
       </w:pPr>
       <w:r>
-        <w:t xml:space="preserve">What is the y-intercept?</w:t>
+        <w:t xml:space="preserve">Which describes the end behavior?</w:t>
       </w:r>
     </w:p>
     <w:p>
@@ -973,7 +1619,7 @@
         <w:t xml:space="preserve">A.  </w:t>
       </w:r>
       <w:r>
-        <w:t xml:space="preserve">(0, 24)</w:t>
+        <w:t xml:space="preserve">Both ends go up</w:t>
       </w:r>
     </w:p>
     <w:p>
@@ -989,7 +1635,7 @@
         <w:t xml:space="preserve">B.  </w:t>
       </w:r>
       <w:r>
-        <w:t xml:space="preserve">(0, −72)</w:t>
+        <w:t xml:space="preserve">Left end down, right end up</w:t>
       </w:r>
     </w:p>
     <w:p>
@@ -1005,7 +1651,7 @@
         <w:t xml:space="preserve">C.  </w:t>
       </w:r>
       <w:r>
-        <w:t xml:space="preserve">(0, 2)</w:t>
+        <w:t xml:space="preserve">Both ends go down</w:t>
       </w:r>
     </w:p>
     <w:p>
@@ -1021,7 +1667,7 @@
         <w:t xml:space="preserve">D.  </w:t>
       </w:r>
       <w:r>
-        <w:t xml:space="preserve">(0, 72)</w:t>
+        <w:t xml:space="preserve">Left end up, right end down</w:t>
       </w:r>
     </w:p>
     <w:p>
@@ -1038,100 +1684,72 @@
         <w:spacing w:after="120" w:before="80" w:line="300"/>
       </w:pPr>
       <w:r>
-        <w:rPr>
-          <w:i/>
-          <w:iCs/>
-        </w:rPr>
-        <w:t xml:space="preserve">f(0)=2(0−3)</w:t>
-      </w:r>
-      <w:r>
-        <w:rPr>
-          <w:i/>
-          <w:iCs/>
-          <w:vertAlign w:val="superscript"/>
-        </w:rPr>
-        <w:t xml:space="preserve">2</w:t>
-      </w:r>
-      <w:r>
-        <w:rPr>
-          <w:i/>
-          <w:iCs/>
-        </w:rPr>
-        <w:t xml:space="preserve">(0+4)=2· 9· 4=72</w:t>
-      </w:r>
-      <w:r>
-        <w:t xml:space="preserve">. Square first: </w:t>
-      </w:r>
-      <w:r>
-        <w:rPr>
-          <w:i/>
-          <w:iCs/>
-        </w:rPr>
-        <w:t xml:space="preserve">(−3)</w:t>
-      </w:r>
-      <w:r>
-        <w:rPr>
-          <w:i/>
-          <w:iCs/>
-          <w:vertAlign w:val="superscript"/>
-        </w:rPr>
-        <w:t xml:space="preserve">2</w:t>
-      </w:r>
-      <w:r>
-        <w:rPr>
-          <w:i/>
-          <w:iCs/>
-        </w:rPr>
-        <w:t xml:space="preserve">=9</w:t>
-      </w:r>
-      <w:r>
-        <w:t xml:space="preserve">, which is positive. The answer 24 forgets the square, </w:t>
-      </w:r>
-      <w:r>
-        <w:rPr>
-          <w:i/>
-          <w:iCs/>
-        </w:rPr>
-        <w:t xml:space="preserve">2· 3· 4</w:t>
-      </w:r>
-      <w:r>
-        <w:t xml:space="preserve">; −72 squares </w:t>
-      </w:r>
-      <w:r>
-        <w:rPr>
-          <w:i/>
-          <w:iCs/>
-        </w:rPr>
-        <w:t xml:space="preserve">−3</w:t>
-      </w:r>
-      <w:r>
-        <w:t xml:space="preserve"> to get </w:t>
-      </w:r>
-      <w:r>
-        <w:rPr>
-          <w:i/>
-          <w:iCs/>
-        </w:rPr>
-        <w:t xml:space="preserve">−9</w:t>
-      </w:r>
-      <w:r>
-        <w:t xml:space="preserve">; and 2 is just the coefficient. </w:t>
-      </w:r>
-      <w:r>
-        <w:rPr>
-          <w:b/>
-          <w:bCs/>
-          <w:i/>
-          <w:iCs/>
-        </w:rPr>
-        <w:t xml:space="preserve">(0,72)</w:t>
-      </w:r>
-      <w:r>
-        <w:rPr>
-          <w:b/>
-          <w:bCs/>
-        </w:rPr>
-        <w:t xml:space="preserve">.</w:t>
+        <w:t xml:space="preserve">The degree is </w:t>
+      </w:r>
+      <w:r>
+        <w:rPr>
+          <w:i/>
+          <w:iCs/>
+        </w:rPr>
+        <w:t xml:space="preserve">2+2=4</w:t>
+      </w:r>
+      <w:r>
+        <w:t xml:space="preserve">, which is even, so both ends go the same way. The leading coefficient −2 is negative, so both go down, like </w:t>
+      </w:r>
+      <w:r>
+        <w:rPr>
+          <w:i/>
+          <w:iCs/>
+        </w:rPr>
+        <w:t xml:space="preserve">y=−x</w:t>
+      </w:r>
+      <w:r>
+        <w:rPr>
+          <w:i/>
+          <w:iCs/>
+          <w:vertAlign w:val="superscript"/>
+        </w:rPr>
+        <w:t xml:space="preserve">4</w:t>
+      </w:r>
+      <w:r>
+        <w:t xml:space="preserve">. In CheckIt's words: as </w:t>
+      </w:r>
+      <w:r>
+        <w:rPr>
+          <w:i/>
+          <w:iCs/>
+        </w:rPr>
+        <w:t xml:space="preserve">x</w:t>
+      </w:r>
+      <w:r>
+        <w:t xml:space="preserve"> approaches infinity and as </w:t>
+      </w:r>
+      <w:r>
+        <w:rPr>
+          <w:i/>
+          <w:iCs/>
+        </w:rPr>
+        <w:t xml:space="preserve">x</w:t>
+      </w:r>
+      <w:r>
+        <w:t xml:space="preserve"> approaches negative infinity, </w:t>
+      </w:r>
+      <w:r>
+        <w:rPr>
+          <w:i/>
+          <w:iCs/>
+        </w:rPr>
+        <w:t xml:space="preserve">y</w:t>
+      </w:r>
+      <w:r>
+        <w:t xml:space="preserve"> approaches negative infinity. </w:t>
+      </w:r>
+      <w:r>
+        <w:rPr>
+          <w:b/>
+          <w:bCs/>
+        </w:rPr>
+        <w:t xml:space="preserve">Down on both the left and the right.</w:t>
       </w:r>
     </w:p>
     <w:p>
@@ -1140,642 +1758,6 @@
         <w:pageBreakBefore/>
       </w:pPr>
       <w:r>
-        <w:t xml:space="preserve">Example 6: Intercept 2</w:t>
-      </w:r>
-    </w:p>
-    <w:p>
-      <w:pPr>
-        <w:spacing w:after="200" w:before="200"/>
-        <w:jc w:val="center"/>
-      </w:pPr>
-      <w:r>
-        <w:rPr>
-          <w:i/>
-          <w:iCs/>
-          <w:sz w:val="40"/>
-          <w:szCs w:val="40"/>
-        </w:rPr>
-        <w:t xml:space="preserve">f(x)=−3(x+2)</w:t>
-      </w:r>
-      <w:r>
-        <w:rPr>
-          <w:i/>
-          <w:iCs/>
-          <w:sz w:val="40"/>
-          <w:szCs w:val="40"/>
-          <w:vertAlign w:val="superscript"/>
-        </w:rPr>
-        <w:t xml:space="preserve">2</w:t>
-      </w:r>
-      <w:r>
-        <w:rPr>
-          <w:i/>
-          <w:iCs/>
-          <w:sz w:val="40"/>
-          <w:szCs w:val="40"/>
-        </w:rPr>
-        <w:t xml:space="preserve">(x−5)</w:t>
-      </w:r>
-      <w:r>
-        <w:rPr>
-          <w:i/>
-          <w:iCs/>
-          <w:sz w:val="40"/>
-          <w:szCs w:val="40"/>
-          <w:vertAlign w:val="superscript"/>
-        </w:rPr>
-        <w:t xml:space="preserve">2</w:t>
-      </w:r>
-    </w:p>
-    <w:p>
-      <w:pPr>
-        <w:pStyle w:val="Heading3"/>
-        <w:keepNext/>
-      </w:pPr>
-      <w:r>
-        <w:t xml:space="preserve">Question</w:t>
-      </w:r>
-    </w:p>
-    <w:p>
-      <w:pPr>
-        <w:spacing w:after="120" w:before="80" w:line="300"/>
-      </w:pPr>
-      <w:r>
-        <w:t xml:space="preserve">What is the y-intercept?</w:t>
-      </w:r>
-    </w:p>
-    <w:p>
-      <w:pPr>
-        <w:spacing w:after="40" w:before="20"/>
-        <w:ind w:left="360"/>
-      </w:pPr>
-      <w:r>
-        <w:rPr>
-          <w:b/>
-          <w:bCs/>
-        </w:rPr>
-        <w:t xml:space="preserve">A.  </w:t>
-      </w:r>
-      <w:r>
-        <w:t xml:space="preserve">(0, −300)</w:t>
-      </w:r>
-    </w:p>
-    <w:p>
-      <w:pPr>
-        <w:spacing w:after="40" w:before="20"/>
-        <w:ind w:left="360"/>
-      </w:pPr>
-      <w:r>
-        <w:rPr>
-          <w:b/>
-          <w:bCs/>
-        </w:rPr>
-        <w:t xml:space="preserve">B.  </w:t>
-      </w:r>
-      <w:r>
-        <w:t xml:space="preserve">(0, 300)</w:t>
-      </w:r>
-    </w:p>
-    <w:p>
-      <w:pPr>
-        <w:spacing w:after="40" w:before="20"/>
-        <w:ind w:left="360"/>
-      </w:pPr>
-      <w:r>
-        <w:rPr>
-          <w:b/>
-          <w:bCs/>
-        </w:rPr>
-        <w:t xml:space="preserve">C.  </w:t>
-      </w:r>
-      <w:r>
-        <w:t xml:space="preserve">(0, −30)</w:t>
-      </w:r>
-    </w:p>
-    <w:p>
-      <w:pPr>
-        <w:spacing w:after="40" w:before="20"/>
-        <w:ind w:left="360"/>
-      </w:pPr>
-      <w:r>
-        <w:rPr>
-          <w:b/>
-          <w:bCs/>
-        </w:rPr>
-        <w:t xml:space="preserve">D.  </w:t>
-      </w:r>
-      <w:r>
-        <w:t xml:space="preserve">(0, −150)</w:t>
-      </w:r>
-    </w:p>
-    <w:p>
-      <w:pPr>
-        <w:pStyle w:val="Heading3"/>
-        <w:keepNext/>
-      </w:pPr>
-      <w:r>
-        <w:t xml:space="preserve">Answer and reasoning</w:t>
-      </w:r>
-    </w:p>
-    <w:p>
-      <w:pPr>
-        <w:spacing w:after="120" w:before="80" w:line="300"/>
-      </w:pPr>
-      <w:r>
-        <w:rPr>
-          <w:i/>
-          <w:iCs/>
-        </w:rPr>
-        <w:t xml:space="preserve">f(0)=−3(2)</w:t>
-      </w:r>
-      <w:r>
-        <w:rPr>
-          <w:i/>
-          <w:iCs/>
-          <w:vertAlign w:val="superscript"/>
-        </w:rPr>
-        <w:t xml:space="preserve">2</w:t>
-      </w:r>
-      <w:r>
-        <w:rPr>
-          <w:i/>
-          <w:iCs/>
-        </w:rPr>
-        <w:t xml:space="preserve">(−5)</w:t>
-      </w:r>
-      <w:r>
-        <w:rPr>
-          <w:i/>
-          <w:iCs/>
-          <w:vertAlign w:val="superscript"/>
-        </w:rPr>
-        <w:t xml:space="preserve">2</w:t>
-      </w:r>
-      <w:r>
-        <w:rPr>
-          <w:i/>
-          <w:iCs/>
-        </w:rPr>
-        <w:t xml:space="preserve">=−3· 4· 25=−300</w:t>
-      </w:r>
-      <w:r>
-        <w:t xml:space="preserve">. Both squares are positive, so the sign comes only from the −3. The answer 300 loses that sign, −30 forgets both squares, and −150 squares only one of them. </w:t>
-      </w:r>
-      <w:r>
-        <w:rPr>
-          <w:b/>
-          <w:bCs/>
-          <w:i/>
-          <w:iCs/>
-        </w:rPr>
-        <w:t xml:space="preserve">(0,−300)</w:t>
-      </w:r>
-      <w:r>
-        <w:rPr>
-          <w:b/>
-          <w:bCs/>
-        </w:rPr>
-        <w:t xml:space="preserve">.</w:t>
-      </w:r>
-    </w:p>
-    <w:p>
-      <w:pPr>
-        <w:pStyle w:val="Heading2"/>
-        <w:pageBreakBefore/>
-      </w:pPr>
-      <w:r>
-        <w:t xml:space="preserve">Example 7: Ends 1</w:t>
-      </w:r>
-    </w:p>
-    <w:p>
-      <w:pPr>
-        <w:spacing w:after="200" w:before="200"/>
-        <w:jc w:val="center"/>
-      </w:pPr>
-      <w:r>
-        <w:rPr>
-          <w:i/>
-          <w:iCs/>
-          <w:sz w:val="40"/>
-          <w:szCs w:val="40"/>
-        </w:rPr>
-        <w:t xml:space="preserve">f(x)=4(x−2)</w:t>
-      </w:r>
-      <w:r>
-        <w:rPr>
-          <w:i/>
-          <w:iCs/>
-          <w:sz w:val="40"/>
-          <w:szCs w:val="40"/>
-          <w:vertAlign w:val="superscript"/>
-        </w:rPr>
-        <w:t xml:space="preserve">2</w:t>
-      </w:r>
-      <w:r>
-        <w:rPr>
-          <w:i/>
-          <w:iCs/>
-          <w:sz w:val="40"/>
-          <w:szCs w:val="40"/>
-        </w:rPr>
-        <w:t xml:space="preserve">(x+3)</w:t>
-      </w:r>
-    </w:p>
-    <w:p>
-      <w:pPr>
-        <w:pStyle w:val="Heading3"/>
-        <w:keepNext/>
-      </w:pPr>
-      <w:r>
-        <w:t xml:space="preserve">Question</w:t>
-      </w:r>
-    </w:p>
-    <w:p>
-      <w:pPr>
-        <w:spacing w:after="120" w:before="80" w:line="300"/>
-      </w:pPr>
-      <w:r>
-        <w:t xml:space="preserve">Which describes the end behavior?</w:t>
-      </w:r>
-    </w:p>
-    <w:p>
-      <w:pPr>
-        <w:spacing w:after="40" w:before="20"/>
-        <w:ind w:left="360"/>
-      </w:pPr>
-      <w:r>
-        <w:rPr>
-          <w:b/>
-          <w:bCs/>
-        </w:rPr>
-        <w:t xml:space="preserve">A.  </w:t>
-      </w:r>
-      <w:r>
-        <w:t xml:space="preserve">Both ends go up</w:t>
-      </w:r>
-    </w:p>
-    <w:p>
-      <w:pPr>
-        <w:spacing w:after="40" w:before="20"/>
-        <w:ind w:left="360"/>
-      </w:pPr>
-      <w:r>
-        <w:rPr>
-          <w:b/>
-          <w:bCs/>
-        </w:rPr>
-        <w:t xml:space="preserve">B.  </w:t>
-      </w:r>
-      <w:r>
-        <w:t xml:space="preserve">Left end down, right end up</w:t>
-      </w:r>
-    </w:p>
-    <w:p>
-      <w:pPr>
-        <w:spacing w:after="40" w:before="20"/>
-        <w:ind w:left="360"/>
-      </w:pPr>
-      <w:r>
-        <w:rPr>
-          <w:b/>
-          <w:bCs/>
-        </w:rPr>
-        <w:t xml:space="preserve">C.  </w:t>
-      </w:r>
-      <w:r>
-        <w:t xml:space="preserve">Left end up, right end down</w:t>
-      </w:r>
-    </w:p>
-    <w:p>
-      <w:pPr>
-        <w:spacing w:after="40" w:before="20"/>
-        <w:ind w:left="360"/>
-      </w:pPr>
-      <w:r>
-        <w:rPr>
-          <w:b/>
-          <w:bCs/>
-        </w:rPr>
-        <w:t xml:space="preserve">D.  </w:t>
-      </w:r>
-      <w:r>
-        <w:t xml:space="preserve">Both ends go down</w:t>
-      </w:r>
-    </w:p>
-    <w:p>
-      <w:pPr>
-        <w:pStyle w:val="Heading3"/>
-        <w:keepNext/>
-      </w:pPr>
-      <w:r>
-        <w:t xml:space="preserve">Answer and reasoning</w:t>
-      </w:r>
-    </w:p>
-    <w:p>
-      <w:pPr>
-        <w:spacing w:after="120" w:before="80" w:line="300"/>
-      </w:pPr>
-      <w:r>
-        <w:t xml:space="preserve">The degree is </w:t>
-      </w:r>
-      <w:r>
-        <w:rPr>
-          <w:i/>
-          <w:iCs/>
-        </w:rPr>
-        <w:t xml:space="preserve">2+1=3</w:t>
-      </w:r>
-      <w:r>
-        <w:t xml:space="preserve">, which is odd, so the ends go opposite ways. The leading coefficient 4 is positive, so the graph goes up on the right, like </w:t>
-      </w:r>
-      <w:r>
-        <w:rPr>
-          <w:i/>
-          <w:iCs/>
-        </w:rPr>
-        <w:t xml:space="preserve">y=x</w:t>
-      </w:r>
-      <w:r>
-        <w:rPr>
-          <w:i/>
-          <w:iCs/>
-          <w:vertAlign w:val="superscript"/>
-        </w:rPr>
-        <w:t xml:space="preserve">3</w:t>
-      </w:r>
-      <w:r>
-        <w:t xml:space="preserve">. In CheckIt's words: as </w:t>
-      </w:r>
-      <w:r>
-        <w:rPr>
-          <w:i/>
-          <w:iCs/>
-        </w:rPr>
-        <w:t xml:space="preserve">x</w:t>
-      </w:r>
-      <w:r>
-        <w:t xml:space="preserve"> approaches infinity, </w:t>
-      </w:r>
-      <w:r>
-        <w:rPr>
-          <w:i/>
-          <w:iCs/>
-        </w:rPr>
-        <w:t xml:space="preserve">y</w:t>
-      </w:r>
-      <w:r>
-        <w:t xml:space="preserve"> approaches positive infinity; as </w:t>
-      </w:r>
-      <w:r>
-        <w:rPr>
-          <w:i/>
-          <w:iCs/>
-        </w:rPr>
-        <w:t xml:space="preserve">x</w:t>
-      </w:r>
-      <w:r>
-        <w:t xml:space="preserve"> approaches negative infinity, </w:t>
-      </w:r>
-      <w:r>
-        <w:rPr>
-          <w:i/>
-          <w:iCs/>
-        </w:rPr>
-        <w:t xml:space="preserve">y</w:t>
-      </w:r>
-      <w:r>
-        <w:t xml:space="preserve"> approaches negative infinity. </w:t>
-      </w:r>
-      <w:r>
-        <w:rPr>
-          <w:b/>
-          <w:bCs/>
-        </w:rPr>
-        <w:t xml:space="preserve">Down on the left, up on the right.</w:t>
-      </w:r>
-    </w:p>
-    <w:p>
-      <w:pPr>
-        <w:pStyle w:val="Heading2"/>
-        <w:pageBreakBefore/>
-      </w:pPr>
-      <w:r>
-        <w:t xml:space="preserve">Example 8: Ends 2</w:t>
-      </w:r>
-    </w:p>
-    <w:p>
-      <w:pPr>
-        <w:spacing w:after="200" w:before="200"/>
-        <w:jc w:val="center"/>
-      </w:pPr>
-      <w:r>
-        <w:rPr>
-          <w:i/>
-          <w:iCs/>
-          <w:sz w:val="40"/>
-          <w:szCs w:val="40"/>
-        </w:rPr>
-        <w:t xml:space="preserve">f(x)=−2(x+4)</w:t>
-      </w:r>
-      <w:r>
-        <w:rPr>
-          <w:i/>
-          <w:iCs/>
-          <w:sz w:val="40"/>
-          <w:szCs w:val="40"/>
-          <w:vertAlign w:val="superscript"/>
-        </w:rPr>
-        <w:t xml:space="preserve">2</w:t>
-      </w:r>
-      <w:r>
-        <w:rPr>
-          <w:i/>
-          <w:iCs/>
-          <w:sz w:val="40"/>
-          <w:szCs w:val="40"/>
-        </w:rPr>
-        <w:t xml:space="preserve">(x−1)</w:t>
-      </w:r>
-      <w:r>
-        <w:rPr>
-          <w:i/>
-          <w:iCs/>
-          <w:sz w:val="40"/>
-          <w:szCs w:val="40"/>
-          <w:vertAlign w:val="superscript"/>
-        </w:rPr>
-        <w:t xml:space="preserve">2</w:t>
-      </w:r>
-    </w:p>
-    <w:p>
-      <w:pPr>
-        <w:pStyle w:val="Heading3"/>
-        <w:keepNext/>
-      </w:pPr>
-      <w:r>
-        <w:t xml:space="preserve">Question</w:t>
-      </w:r>
-    </w:p>
-    <w:p>
-      <w:pPr>
-        <w:spacing w:after="120" w:before="80" w:line="300"/>
-      </w:pPr>
-      <w:r>
-        <w:t xml:space="preserve">Which describes the end behavior?</w:t>
-      </w:r>
-    </w:p>
-    <w:p>
-      <w:pPr>
-        <w:spacing w:after="40" w:before="20"/>
-        <w:ind w:left="360"/>
-      </w:pPr>
-      <w:r>
-        <w:rPr>
-          <w:b/>
-          <w:bCs/>
-        </w:rPr>
-        <w:t xml:space="preserve">A.  </w:t>
-      </w:r>
-      <w:r>
-        <w:t xml:space="preserve">Both ends go up</w:t>
-      </w:r>
-    </w:p>
-    <w:p>
-      <w:pPr>
-        <w:spacing w:after="40" w:before="20"/>
-        <w:ind w:left="360"/>
-      </w:pPr>
-      <w:r>
-        <w:rPr>
-          <w:b/>
-          <w:bCs/>
-        </w:rPr>
-        <w:t xml:space="preserve">B.  </w:t>
-      </w:r>
-      <w:r>
-        <w:t xml:space="preserve">Left end down, right end up</w:t>
-      </w:r>
-    </w:p>
-    <w:p>
-      <w:pPr>
-        <w:spacing w:after="40" w:before="20"/>
-        <w:ind w:left="360"/>
-      </w:pPr>
-      <w:r>
-        <w:rPr>
-          <w:b/>
-          <w:bCs/>
-        </w:rPr>
-        <w:t xml:space="preserve">C.  </w:t>
-      </w:r>
-      <w:r>
-        <w:t xml:space="preserve">Both ends go down</w:t>
-      </w:r>
-    </w:p>
-    <w:p>
-      <w:pPr>
-        <w:spacing w:after="40" w:before="20"/>
-        <w:ind w:left="360"/>
-      </w:pPr>
-      <w:r>
-        <w:rPr>
-          <w:b/>
-          <w:bCs/>
-        </w:rPr>
-        <w:t xml:space="preserve">D.  </w:t>
-      </w:r>
-      <w:r>
-        <w:t xml:space="preserve">Left end up, right end down</w:t>
-      </w:r>
-    </w:p>
-    <w:p>
-      <w:pPr>
-        <w:pStyle w:val="Heading3"/>
-        <w:keepNext/>
-      </w:pPr>
-      <w:r>
-        <w:t xml:space="preserve">Answer and reasoning</w:t>
-      </w:r>
-    </w:p>
-    <w:p>
-      <w:pPr>
-        <w:spacing w:after="120" w:before="80" w:line="300"/>
-      </w:pPr>
-      <w:r>
-        <w:t xml:space="preserve">The degree is </w:t>
-      </w:r>
-      <w:r>
-        <w:rPr>
-          <w:i/>
-          <w:iCs/>
-        </w:rPr>
-        <w:t xml:space="preserve">2+2=4</w:t>
-      </w:r>
-      <w:r>
-        <w:t xml:space="preserve">, which is even, so both ends go the same way. The leading coefficient −2 is negative, so both go down, like </w:t>
-      </w:r>
-      <w:r>
-        <w:rPr>
-          <w:i/>
-          <w:iCs/>
-        </w:rPr>
-        <w:t xml:space="preserve">y=−x</w:t>
-      </w:r>
-      <w:r>
-        <w:rPr>
-          <w:i/>
-          <w:iCs/>
-          <w:vertAlign w:val="superscript"/>
-        </w:rPr>
-        <w:t xml:space="preserve">4</w:t>
-      </w:r>
-      <w:r>
-        <w:t xml:space="preserve">. In CheckIt's words: as </w:t>
-      </w:r>
-      <w:r>
-        <w:rPr>
-          <w:i/>
-          <w:iCs/>
-        </w:rPr>
-        <w:t xml:space="preserve">x</w:t>
-      </w:r>
-      <w:r>
-        <w:t xml:space="preserve"> approaches infinity and as </w:t>
-      </w:r>
-      <w:r>
-        <w:rPr>
-          <w:i/>
-          <w:iCs/>
-        </w:rPr>
-        <w:t xml:space="preserve">x</w:t>
-      </w:r>
-      <w:r>
-        <w:t xml:space="preserve"> approaches negative infinity, </w:t>
-      </w:r>
-      <w:r>
-        <w:rPr>
-          <w:i/>
-          <w:iCs/>
-        </w:rPr>
-        <w:t xml:space="preserve">y</w:t>
-      </w:r>
-      <w:r>
-        <w:t xml:space="preserve"> approaches negative infinity. </w:t>
-      </w:r>
-      <w:r>
-        <w:rPr>
-          <w:b/>
-          <w:bCs/>
-        </w:rPr>
-        <w:t xml:space="preserve">Down on both the left and the right.</w:t>
-      </w:r>
-    </w:p>
-    <w:p>
-      <w:pPr>
-        <w:pStyle w:val="Heading2"/>
-        <w:pageBreakBefore/>
-      </w:pPr>
-      <w:r>
         <w:t xml:space="preserve">Example 9: Match 1</w:t>
       </w:r>
     </w:p>
@@ -1786,7 +1768,7 @@
       <w:r>
         <w:drawing>
           <wp:inline distT="0" distB="0" distL="0" distR="0">
-            <wp:extent cx="3609975" cy="2476500"/>
+            <wp:extent cx="3276600" cy="2476500"/>
             <wp:effectExtent t="0" r="0" b="0" l="0"/>
             <wp:docPr id="1" name="mg1" descr="A polynomial graph with two zeros and a y-intercept. Plotted data: A graph on axes with x from about −4.5 to 3.5 and y from −60 to 60. Coming from the lower left, it rises to meet the x-axis at (−3, 0), turns back down without going above the axis, reaches a low point just right of the y-axis, passing through the y-intercept (0, −36), then rises through the x-axis at (2, 0) and keeps rising to the upper right. The two zeros and the y-intercept are labeled." title="A polynomial graph with two zeros and a y-intercept"/>
             <wp:cNvGraphicFramePr>
@@ -1811,7 +1793,7 @@
                   <pic:spPr bwMode="auto">
                     <a:xfrm>
                       <a:off x="0" y="0"/>
-                      <a:ext cx="3609975" cy="2476500"/>
+                      <a:ext cx="3276600" cy="2476500"/>
                     </a:xfrm>
                     <a:prstGeom prst="rect">
                       <a:avLst/>
@@ -2153,7 +2135,7 @@
       <w:r>
         <w:drawing>
           <wp:inline distT="0" distB="0" distL="0" distR="0">
-            <wp:extent cx="3609975" cy="2476500"/>
+            <wp:extent cx="3286125" cy="2476500"/>
             <wp:effectExtent t="0" r="0" b="0" l="0"/>
             <wp:docPr id="1" name="mg2" descr="A polynomial graph with two zeros and a y-intercept. Plotted data: A graph on axes with x from about −5.5 to 2.5 and y from −200 to 200. Coming up from the lower left, it rises to meet the x-axis at (−4, 0) and turns back down, falls to a low point near x = −1.5, rises through the y-intercept (0, −48) to meet the x-axis again at (1, 0), turns back down, and falls to the lower right. The graph never goes above the x-axis. The two zeros and the y-intercept are labeled." title="A polynomial graph with two zeros and a y-intercept"/>
             <wp:cNvGraphicFramePr>
@@ -2178,7 +2160,7 @@
                   <pic:spPr bwMode="auto">
                     <a:xfrm>
                       <a:off x="0" y="0"/>
-                      <a:ext cx="3609975" cy="2476500"/>
+                      <a:ext cx="3286125" cy="2476500"/>
                     </a:xfrm>
                     <a:prstGeom prst="rect">
                       <a:avLst/>
@@ -2567,7 +2549,7 @@
       <w:r>
         <w:drawing>
           <wp:inline distT="0" distB="0" distL="0" distR="0">
-            <wp:extent cx="3609975" cy="2476500"/>
+            <wp:extent cx="3286125" cy="2476500"/>
             <wp:effectExtent t="0" r="0" b="0" l="0"/>
             <wp:docPr id="1" name="mg3" descr="A polynomial graph with two zeros and a y-intercept. Plotted data: A graph on axes with x from about −3.5 to 5.5 and y from −200 to 200. Coming from the lower left, it rises to meet the x-axis at (−2, 0), turns back down without going above the axis, passes through the y-intercept (0, −64), reaches a low point near x = 2, then rises through the x-axis at (4, 0) and keeps rising to the upper right. The two zeros and the y-intercept are labeled." title="A polynomial graph with two zeros and a y-intercept"/>
             <wp:cNvGraphicFramePr>
@@ -2592,7 +2574,7 @@
                   <pic:spPr bwMode="auto">
                     <a:xfrm>
                       <a:off x="0" y="0"/>
-                      <a:ext cx="3609975" cy="2476500"/>
+                      <a:ext cx="3286125" cy="2476500"/>
                     </a:xfrm>
                     <a:prstGeom prst="rect">
                       <a:avLst/>
@@ -2934,73 +2916,41 @@
         <w:pageBreakBefore/>
       </w:pPr>
       <w:r>
-        <w:t xml:space="preserve">Example 12: Match 4</w:t>
-      </w:r>
-    </w:p>
-    <w:p>
-      <w:pPr>
-        <w:spacing w:after="60" w:before="60"/>
-      </w:pPr>
-      <w:r>
-        <w:drawing>
-          <wp:inline distT="0" distB="0" distL="0" distR="0">
-            <wp:extent cx="3629025" cy="2476500"/>
-            <wp:effectExtent t="0" r="0" b="0" l="0"/>
-            <wp:docPr id="1" name="mg4" descr="A polynomial graph with two zeros and a y-intercept. Plotted data: A graph on axes with x from about −2.5 to 4.5 and y from −30 to 30. Coming down from the upper left, it falls through the x-axis at (−1, 0), passes through the y-intercept (0, −18) near its low point, rises to meet the x-axis at (3, 0), turns back down without going above the axis, and falls to the lower right. The two zeros and the y-intercept are labeled." title="A polynomial graph with two zeros and a y-intercept"/>
-            <wp:cNvGraphicFramePr>
-              <a:graphicFrameLocks xmlns:a="http://schemas.openxmlformats.org/drawingml/2006/main" noChangeAspect="1"/>
-            </wp:cNvGraphicFramePr>
-            <a:graphic xmlns:a="http://schemas.openxmlformats.org/drawingml/2006/main">
-              <a:graphicData uri="http://schemas.openxmlformats.org/drawingml/2006/picture">
-                <pic:pic xmlns:pic="http://schemas.openxmlformats.org/drawingml/2006/picture">
-                  <pic:nvPicPr>
-                    <pic:cNvPr id="0" name="" descr=""/>
-                    <pic:cNvPicPr>
-                      <a:picLocks noChangeAspect="1" noChangeArrowheads="1"/>
-                    </pic:cNvPicPr>
-                  </pic:nvPicPr>
-                  <pic:blipFill>
-                    <a:blip r:embed="rId12" cstate="none"/>
-                    <a:srcRect/>
-                    <a:stretch>
-                      <a:fillRect/>
-                    </a:stretch>
-                  </pic:blipFill>
-                  <pic:spPr bwMode="auto">
-                    <a:xfrm>
-                      <a:off x="0" y="0"/>
-                      <a:ext cx="3629025" cy="2476500"/>
-                    </a:xfrm>
-                    <a:prstGeom prst="rect">
-                      <a:avLst/>
-                    </a:prstGeom>
-                  </pic:spPr>
-                </pic:pic>
-              </a:graphicData>
-            </a:graphic>
-          </wp:inline>
-        </w:drawing>
-      </w:r>
-    </w:p>
-    <w:p>
-      <w:pPr>
-        <w:spacing w:after="120" w:before="80" w:line="300"/>
-      </w:pPr>
-      <w:r>
-        <w:rPr>
-          <w:b/>
-          <w:bCs/>
-          <w:sz w:val="22"/>
-          <w:szCs w:val="22"/>
-        </w:rPr>
-        <w:t xml:space="preserve">Plotted data: </w:t>
-      </w:r>
-      <w:r>
-        <w:rPr>
-          <w:sz w:val="22"/>
-          <w:szCs w:val="22"/>
-        </w:rPr>
-        <w:t xml:space="preserve">A graph on axes with x from about −2.5 to 4.5 and y from −30 to 30. Coming down from the upper left, it falls through the x-axis at (−1, 0), passes through the y-intercept (0, −18) near its low point, rises to meet the x-axis at (3, 0), turns back down without going above the axis, and falls to the lower right. The two zeros and the y-intercept are labeled.</w:t>
+        <w:t xml:space="preserve">Example 12: Sketch It</w:t>
+      </w:r>
+    </w:p>
+    <w:p>
+      <w:pPr>
+        <w:spacing w:after="200" w:before="200"/>
+        <w:jc w:val="center"/>
+      </w:pPr>
+      <w:r>
+        <w:rPr>
+          <w:i/>
+          <w:iCs/>
+          <w:sz w:val="40"/>
+          <w:szCs w:val="40"/>
+        </w:rPr>
+        <w:t xml:space="preserve">f(x)=−2(x−3)</w:t>
+      </w:r>
+      <w:r>
+        <w:rPr>
+          <w:i/>
+          <w:iCs/>
+          <w:sz w:val="40"/>
+          <w:szCs w:val="40"/>
+          <w:vertAlign w:val="superscript"/>
+        </w:rPr>
+        <w:t xml:space="preserve">2</w:t>
+      </w:r>
+      <w:r>
+        <w:rPr>
+          <w:i/>
+          <w:iCs/>
+          <w:sz w:val="40"/>
+          <w:szCs w:val="40"/>
+        </w:rPr>
+        <w:t xml:space="preserve">(x+1)</w:t>
       </w:r>
     </w:p>
     <w:p>
@@ -3017,7 +2967,7 @@
         <w:spacing w:after="120" w:before="80" w:line="300"/>
       </w:pPr>
       <w:r>
-        <w:t xml:space="preserve">Which formula matches this graph?</w:t>
+        <w:t xml:space="preserve">CheckIt will ask you to sketch this. Reading from left to right, which description of the graph is right?</w:t>
       </w:r>
     </w:p>
     <w:p>
@@ -3033,26 +2983,7 @@
         <w:t xml:space="preserve">A.  </w:t>
       </w:r>
       <w:r>
-        <w:rPr>
-          <w:i/>
-          <w:iCs/>
-        </w:rPr>
-        <w:t xml:space="preserve">f(x)=2(x−3)</w:t>
-      </w:r>
-      <w:r>
-        <w:rPr>
-          <w:i/>
-          <w:iCs/>
-          <w:vertAlign w:val="superscript"/>
-        </w:rPr>
-        <w:t xml:space="preserve">2</w:t>
-      </w:r>
-      <w:r>
-        <w:rPr>
-          <w:i/>
-          <w:iCs/>
-        </w:rPr>
-        <w:t xml:space="preserve">(x+1)</w:t>
+        <w:t xml:space="preserve">Starts low, goes through the axis at −1, turns at 3, ends high</w:t>
       </w:r>
     </w:p>
     <w:p>
@@ -3068,19 +2999,7 @@
         <w:t xml:space="preserve">B.  </w:t>
       </w:r>
       <w:r>
-        <w:rPr>
-          <w:i/>
-          <w:iCs/>
-        </w:rPr>
-        <w:t xml:space="preserve">f(x)=−2(x−3)(x+1)</w:t>
-      </w:r>
-      <w:r>
-        <w:rPr>
-          <w:i/>
-          <w:iCs/>
-          <w:vertAlign w:val="superscript"/>
-        </w:rPr>
-        <w:t xml:space="preserve">2</w:t>
+        <w:t xml:space="preserve">Starts high, turns at −1, goes through the axis at 3, ends low</w:t>
       </w:r>
     </w:p>
     <w:p>
@@ -3096,26 +3015,7 @@
         <w:t xml:space="preserve">C.  </w:t>
       </w:r>
       <w:r>
-        <w:rPr>
-          <w:i/>
-          <w:iCs/>
-        </w:rPr>
-        <w:t xml:space="preserve">f(x)=−2(x−3)</w:t>
-      </w:r>
-      <w:r>
-        <w:rPr>
-          <w:i/>
-          <w:iCs/>
-          <w:vertAlign w:val="superscript"/>
-        </w:rPr>
-        <w:t xml:space="preserve">2</w:t>
-      </w:r>
-      <w:r>
-        <w:rPr>
-          <w:i/>
-          <w:iCs/>
-        </w:rPr>
-        <w:t xml:space="preserve">(x+1)</w:t>
+        <w:t xml:space="preserve">Starts high, goes through the axis at −1, turns at 3, ends low</w:t>
       </w:r>
     </w:p>
     <w:p>
@@ -3131,26 +3031,7 @@
         <w:t xml:space="preserve">D.  </w:t>
       </w:r>
       <w:r>
-        <w:rPr>
-          <w:i/>
-          <w:iCs/>
-        </w:rPr>
-        <w:t xml:space="preserve">f(x)=−2(x+3)</w:t>
-      </w:r>
-      <w:r>
-        <w:rPr>
-          <w:i/>
-          <w:iCs/>
-          <w:vertAlign w:val="superscript"/>
-        </w:rPr>
-        <w:t xml:space="preserve">2</w:t>
-      </w:r>
-      <w:r>
-        <w:rPr>
-          <w:i/>
-          <w:iCs/>
-        </w:rPr>
-        <w:t xml:space="preserve">(x−1)</w:t>
+        <w:t xml:space="preserve">Starts high, goes through the axis at 1, turns at −3, ends low</w:t>
       </w:r>
     </w:p>
     <w:p>
@@ -3167,27 +3048,37 @@
         <w:spacing w:after="120" w:before="80" w:line="300"/>
       </w:pPr>
       <w:r>
-        <w:t xml:space="preserve">It crosses at −1 and turns at 3, so </w:t>
-      </w:r>
-      <w:r>
-        <w:rPr>
-          <w:i/>
-          <w:iCs/>
-        </w:rPr>
-        <w:t xml:space="preserve">(x+1)</w:t>
-      </w:r>
-      <w:r>
-        <w:t xml:space="preserve"> is to an odd power and </w:t>
-      </w:r>
-      <w:r>
-        <w:rPr>
-          <w:i/>
-          <w:iCs/>
-        </w:rPr>
-        <w:t xml:space="preserve">(x−3)</w:t>
-      </w:r>
-      <w:r>
-        <w:t xml:space="preserve"> to an even one. The ends go up on the left and down on the right: odd degree, negative leading coefficient. Check: </w:t>
+        <w:t xml:space="preserve">Degree </w:t>
+      </w:r>
+      <w:r>
+        <w:rPr>
+          <w:i/>
+          <w:iCs/>
+        </w:rPr>
+        <w:t xml:space="preserve">2+1=3</w:t>
+      </w:r>
+      <w:r>
+        <w:t xml:space="preserve"> with a negative leading coefficient: up on the left, down on the right. Coming down from the upper left, the graph crosses at </w:t>
+      </w:r>
+      <w:r>
+        <w:rPr>
+          <w:i/>
+          <w:iCs/>
+        </w:rPr>
+        <w:t xml:space="preserve">x=−1</w:t>
+      </w:r>
+      <w:r>
+        <w:t xml:space="preserve"> (multiplicity 1), dips to a low point, passes through the </w:t>
+      </w:r>
+      <w:r>
+        <w:rPr>
+          <w:i/>
+          <w:iCs/>
+        </w:rPr>
+        <w:t xml:space="preserve">y</w:t>
+      </w:r>
+      <w:r>
+        <w:t xml:space="preserve">-intercept </w:t>
       </w:r>
       <w:r>
         <w:rPr>
@@ -3212,85 +3103,57 @@
         <w:t xml:space="preserve">(1)=−18</w:t>
       </w:r>
       <w:r>
-        <w:t xml:space="preserve">. The positive version has the ends reversed, </w:t>
-      </w:r>
-      <w:r>
-        <w:rPr>
-          <w:i/>
-          <w:iCs/>
-        </w:rPr>
-        <w:t xml:space="preserve">(x+1)</w:t>
-      </w:r>
-      <w:r>
-        <w:rPr>
-          <w:i/>
-          <w:iCs/>
-          <w:vertAlign w:val="superscript"/>
-        </w:rPr>
-        <w:t xml:space="preserve">2</w:t>
-      </w:r>
-      <w:r>
-        <w:t xml:space="preserve"> would turn at −1 instead, and </w:t>
-      </w:r>
-      <w:r>
-        <w:rPr>
-          <w:i/>
-          <w:iCs/>
-        </w:rPr>
-        <w:t xml:space="preserve">(x+3)</w:t>
-      </w:r>
-      <w:r>
-        <w:rPr>
-          <w:i/>
-          <w:iCs/>
-          <w:vertAlign w:val="superscript"/>
-        </w:rPr>
-        <w:t xml:space="preserve">2</w:t>
-      </w:r>
-      <w:r>
-        <w:rPr>
-          <w:i/>
-          <w:iCs/>
-        </w:rPr>
-        <w:t xml:space="preserve">(x−1)</w:t>
-      </w:r>
-      <w:r>
-        <w:t xml:space="preserve"> has zeros at −3 and 1. </w:t>
-      </w:r>
-      <w:r>
-        <w:rPr>
-          <w:b/>
-          <w:bCs/>
-          <w:i/>
-          <w:iCs/>
-        </w:rPr>
-        <w:t xml:space="preserve">f(x)=−2(x−3)</w:t>
-      </w:r>
-      <w:r>
-        <w:rPr>
-          <w:b/>
-          <w:bCs/>
-          <w:i/>
-          <w:iCs/>
-          <w:vertAlign w:val="superscript"/>
-        </w:rPr>
-        <w:t xml:space="preserve">2</w:t>
-      </w:r>
-      <w:r>
-        <w:rPr>
-          <w:b/>
-          <w:bCs/>
-          <w:i/>
-          <w:iCs/>
-        </w:rPr>
-        <w:t xml:space="preserve">(x+1)</w:t>
-      </w:r>
-      <w:r>
-        <w:rPr>
-          <w:b/>
-          <w:bCs/>
-        </w:rPr>
-        <w:t xml:space="preserve">.</w:t>
+        <w:t xml:space="preserve">, rises to touch the axis at </w:t>
+      </w:r>
+      <w:r>
+        <w:rPr>
+          <w:i/>
+          <w:iCs/>
+        </w:rPr>
+        <w:t xml:space="preserve">x=3</w:t>
+      </w:r>
+      <w:r>
+        <w:t xml:space="preserve"> (multiplicity 2), and turns back down. Starting low is the positive version, turning at −1 swaps the multiplicities, and 1 and −3 read the signs as written. </w:t>
+      </w:r>
+      <w:r>
+        <w:rPr>
+          <w:b/>
+          <w:bCs/>
+        </w:rPr>
+        <w:t xml:space="preserve">Starts high, crosses at −1, touches at 3, ends low.</w:t>
+      </w:r>
+      <w:r>
+        <w:t xml:space="preserve"> To sketch it, plot </w:t>
+      </w:r>
+      <w:r>
+        <w:rPr>
+          <w:i/>
+          <w:iCs/>
+        </w:rPr>
+        <w:t xml:space="preserve">(−1,0)</w:t>
+      </w:r>
+      <w:r>
+        <w:t xml:space="preserve">, </w:t>
+      </w:r>
+      <w:r>
+        <w:rPr>
+          <w:i/>
+          <w:iCs/>
+        </w:rPr>
+        <w:t xml:space="preserve">(3,0)</w:t>
+      </w:r>
+      <w:r>
+        <w:t xml:space="preserve">, and </w:t>
+      </w:r>
+      <w:r>
+        <w:rPr>
+          <w:i/>
+          <w:iCs/>
+        </w:rPr>
+        <w:t xml:space="preserve">(0,−18)</w:t>
+      </w:r>
+      <w:r>
+        <w:t xml:space="preserve">, then connect them this way.</w:t>
       </w:r>
     </w:p>
     <w:p>

</xml_diff>